<commit_message>
Update report: reference Flowgorithm flowchart, align sample outputs with its dataset
</commit_message>
<xml_diff>
--- a/docs/CHARS_Assignment_Report.docx
+++ b/docs/CHARS_Assignment_Report.docx
@@ -941,7 +941,7 @@
           <w:sz w:val="20"/>
           <w:szCs w:val="20"/>
         </w:rPr>
-        <w:t xml:space="preserve">	14</w:t>
+        <w:t xml:space="preserve">	15</w:t>
       </w:r>
     </w:p>
     <w:p>
@@ -965,7 +965,7 @@
           <w:sz w:val="20"/>
           <w:szCs w:val="20"/>
         </w:rPr>
-        <w:t xml:space="preserve">	15</w:t>
+        <w:t xml:space="preserve">	16</w:t>
       </w:r>
     </w:p>
     <w:p>
@@ -4663,6 +4663,55 @@
           <w:szCs w:val="20"/>
         </w:rPr>
         <w:t xml:space="preserve">The flowchart below is the visual equivalent of the pseudocode in Section 3, showing the same four decision branches (Check Availability, Check Medicine, Book Appointment, Emergency Referral) and the expanding-radius search pattern shared by the availability and emergency branches. The source file (diagrams/flowchart.mmd, Mermaid format) is included in the project's GitHub repository and can also be opened and edited visually in diagrams.net (Draw.io).</w:t>
+      </w:r>
+    </w:p>
+    <w:p>
+      <w:pPr>
+        <w:spacing w:after="160" w:line="276" w:lineRule="auto"/>
+        <w:jc w:val="both"/>
+      </w:pPr>
+      <w:r>
+        <w:rPr>
+          <w:rFonts w:ascii="Tahoma" w:cs="Tahoma" w:eastAsia="Tahoma" w:hAnsi="Tahoma"/>
+          <w:i/>
+          <w:iCs/>
+          <w:sz w:val="20"/>
+          <w:szCs w:val="20"/>
+        </w:rPr>
+        <w:t xml:space="preserve">In addition to this overview diagram, the same logic was rebuilt as an executable flowchart in Flowgorithm (diagrams/CHARS.fprg, also in the repository), with each module (checkAvailability, checkMedicineStock, bookAppointment, referEmergency) as its own linked flowchart using Flowgorithm's Declare, Input, Output, If, While, For, and Call symbols. Because Flowgorithm has no record/struct data type, each clinic's details are represented as parallel arrays (clinicName, clinicDoctorOnDuty, clinicOpenSlots, clinicACTStock) rather than the Clinic record shown in Section 3 -- the decision and repetition logic is otherwise identical. This version can be run directly to produce the sample outputs in Section 6.</w:t>
+      </w:r>
+    </w:p>
+    <w:p>
+      <w:pPr>
+        <w:spacing w:after="160" w:line="276" w:lineRule="auto"/>
+        <w:jc w:val="both"/>
+      </w:pPr>
+      <w:r>
+        <w:rPr>
+          <w:rFonts w:ascii="Tahoma" w:cs="Tahoma" w:eastAsia="Tahoma" w:hAnsi="Tahoma"/>
+          <w:i/>
+          <w:iCs/>
+          <w:color w:val="A05A00"/>
+          <w:sz w:val="20"/>
+          <w:szCs w:val="20"/>
+        </w:rPr>
+        <w:t xml:space="preserve">Insert a screenshot of the Flowgorithm flowchart (Main and each procedure) below before printing.</w:t>
+      </w:r>
+    </w:p>
+    <w:p>
+      <w:pPr>
+        <w:spacing w:after="300" w:before="200"/>
+      </w:pPr>
+      <w:r>
+        <w:rPr>
+          <w:rFonts w:ascii="Tahoma" w:cs="Tahoma" w:eastAsia="Tahoma" w:hAnsi="Tahoma"/>
+          <w:i/>
+          <w:iCs/>
+          <w:color w:val="888888"/>
+          <w:sz w:val="20"/>
+          <w:szCs w:val="20"/>
+        </w:rPr>
+        <w:t xml:space="preserve">[ Insert Flowgorithm screenshot(s) here ]</w:t>
       </w:r>
     </w:p>
     <w:p>
@@ -5699,6 +5748,619 @@
     </w:p>
     <w:p>
       <w:pPr>
+        <w:spacing w:after="160" w:line="276" w:lineRule="auto"/>
+        <w:jc w:val="both"/>
+      </w:pPr>
+      <w:r>
+        <w:rPr>
+          <w:rFonts w:ascii="Tahoma" w:cs="Tahoma" w:eastAsia="Tahoma" w:hAnsi="Tahoma"/>
+          <w:sz w:val="20"/>
+          <w:szCs w:val="20"/>
+        </w:rPr>
+        <w:t xml:space="preserve">The scenarios below use the fixed five-clinic sample dataset built into the Flowgorithm program (diagrams/CHARS.fprg), so they can be reproduced exactly by running that file -- these are not illustrative-only figures.</w:t>
+      </w:r>
+    </w:p>
+    <w:tbl>
+      <w:tblPr>
+        <w:tblW w:type="pct" w:w="100%"/>
+        <w:tblBorders>
+          <w:top w:val="single" w:color="AAAAAA" w:sz="2"/>
+          <w:left w:val="single" w:color="AAAAAA" w:sz="2"/>
+          <w:bottom w:val="single" w:color="AAAAAA" w:sz="2"/>
+          <w:right w:val="single" w:color="AAAAAA" w:sz="2"/>
+          <w:insideH w:val="single" w:color="AAAAAA" w:sz="2"/>
+          <w:insideV w:val="single" w:color="AAAAAA" w:sz="2"/>
+        </w:tblBorders>
+      </w:tblPr>
+      <w:tblGrid>
+        <w:gridCol w:w="100"/>
+        <w:gridCol w:w="100"/>
+        <w:gridCol w:w="100"/>
+        <w:gridCol w:w="100"/>
+        <w:gridCol w:w="100"/>
+      </w:tblGrid>
+      <w:tr>
+        <w:trPr>
+          <w:tblHeader/>
+        </w:trPr>
+        <w:tc>
+          <w:tcPr>
+            <w:shd w:fill="1F3864" w:val="clear"/>
+            <w:tcMar>
+              <w:top w:type="dxa" w:w="80"/>
+              <w:left w:type="dxa" w:w="100"/>
+              <w:bottom w:type="dxa" w:w="80"/>
+              <w:right w:type="dxa" w:w="100"/>
+            </w:tcMar>
+          </w:tcPr>
+          <w:p>
+            <w:r>
+              <w:rPr>
+                <w:rFonts w:ascii="Tahoma" w:cs="Tahoma" w:eastAsia="Tahoma" w:hAnsi="Tahoma"/>
+                <w:b/>
+                <w:bCs/>
+                <w:color w:val="FFFFFF"/>
+                <w:sz w:val="18"/>
+                <w:szCs w:val="18"/>
+              </w:rPr>
+              <w:t xml:space="preserve">#</w:t>
+            </w:r>
+          </w:p>
+        </w:tc>
+        <w:tc>
+          <w:tcPr>
+            <w:shd w:fill="1F3864" w:val="clear"/>
+            <w:tcMar>
+              <w:top w:type="dxa" w:w="80"/>
+              <w:left w:type="dxa" w:w="100"/>
+              <w:bottom w:type="dxa" w:w="80"/>
+              <w:right w:type="dxa" w:w="100"/>
+            </w:tcMar>
+          </w:tcPr>
+          <w:p>
+            <w:r>
+              <w:rPr>
+                <w:rFonts w:ascii="Tahoma" w:cs="Tahoma" w:eastAsia="Tahoma" w:hAnsi="Tahoma"/>
+                <w:b/>
+                <w:bCs/>
+                <w:color w:val="FFFFFF"/>
+                <w:sz w:val="18"/>
+                <w:szCs w:val="18"/>
+              </w:rPr>
+              <w:t xml:space="preserve">Clinic</w:t>
+            </w:r>
+          </w:p>
+        </w:tc>
+        <w:tc>
+          <w:tcPr>
+            <w:shd w:fill="1F3864" w:val="clear"/>
+            <w:tcMar>
+              <w:top w:type="dxa" w:w="80"/>
+              <w:left w:type="dxa" w:w="100"/>
+              <w:bottom w:type="dxa" w:w="80"/>
+              <w:right w:type="dxa" w:w="100"/>
+            </w:tcMar>
+          </w:tcPr>
+          <w:p>
+            <w:r>
+              <w:rPr>
+                <w:rFonts w:ascii="Tahoma" w:cs="Tahoma" w:eastAsia="Tahoma" w:hAnsi="Tahoma"/>
+                <w:b/>
+                <w:bCs/>
+                <w:color w:val="FFFFFF"/>
+                <w:sz w:val="18"/>
+                <w:szCs w:val="18"/>
+              </w:rPr>
+              <w:t xml:space="preserve">Doctor on duty</w:t>
+            </w:r>
+          </w:p>
+        </w:tc>
+        <w:tc>
+          <w:tcPr>
+            <w:shd w:fill="1F3864" w:val="clear"/>
+            <w:tcMar>
+              <w:top w:type="dxa" w:w="80"/>
+              <w:left w:type="dxa" w:w="100"/>
+              <w:bottom w:type="dxa" w:w="80"/>
+              <w:right w:type="dxa" w:w="100"/>
+            </w:tcMar>
+          </w:tcPr>
+          <w:p>
+            <w:r>
+              <w:rPr>
+                <w:rFonts w:ascii="Tahoma" w:cs="Tahoma" w:eastAsia="Tahoma" w:hAnsi="Tahoma"/>
+                <w:b/>
+                <w:bCs/>
+                <w:color w:val="FFFFFF"/>
+                <w:sz w:val="18"/>
+                <w:szCs w:val="18"/>
+              </w:rPr>
+              <w:t xml:space="preserve">Open slots</w:t>
+            </w:r>
+          </w:p>
+        </w:tc>
+        <w:tc>
+          <w:tcPr>
+            <w:shd w:fill="1F3864" w:val="clear"/>
+            <w:tcMar>
+              <w:top w:type="dxa" w:w="80"/>
+              <w:left w:type="dxa" w:w="100"/>
+              <w:bottom w:type="dxa" w:w="80"/>
+              <w:right w:type="dxa" w:w="100"/>
+            </w:tcMar>
+          </w:tcPr>
+          <w:p>
+            <w:r>
+              <w:rPr>
+                <w:rFonts w:ascii="Tahoma" w:cs="Tahoma" w:eastAsia="Tahoma" w:hAnsi="Tahoma"/>
+                <w:b/>
+                <w:bCs/>
+                <w:color w:val="FFFFFF"/>
+                <w:sz w:val="18"/>
+                <w:szCs w:val="18"/>
+              </w:rPr>
+              <w:t xml:space="preserve">ACT stock</w:t>
+            </w:r>
+          </w:p>
+        </w:tc>
+      </w:tr>
+      <w:tr>
+        <w:tc>
+          <w:tcPr>
+            <w:tcW w:type="pct" w:w="20%"/>
+            <w:tcMar>
+              <w:top w:type="dxa" w:w="80"/>
+              <w:left w:type="dxa" w:w="100"/>
+              <w:bottom w:type="dxa" w:w="80"/>
+              <w:right w:type="dxa" w:w="100"/>
+            </w:tcMar>
+          </w:tcPr>
+          <w:p>
+            <w:r>
+              <w:rPr>
+                <w:rFonts w:ascii="Tahoma" w:cs="Tahoma" w:eastAsia="Tahoma" w:hAnsi="Tahoma"/>
+                <w:b/>
+                <w:bCs/>
+                <w:sz w:val="18"/>
+                <w:szCs w:val="18"/>
+              </w:rPr>
+              <w:t xml:space="preserve">1</w:t>
+            </w:r>
+          </w:p>
+        </w:tc>
+        <w:tc>
+          <w:tcPr>
+            <w:tcW w:type="pct" w:w="35%"/>
+            <w:tcMar>
+              <w:top w:type="dxa" w:w="80"/>
+              <w:left w:type="dxa" w:w="100"/>
+              <w:bottom w:type="dxa" w:w="80"/>
+              <w:right w:type="dxa" w:w="100"/>
+            </w:tcMar>
+          </w:tcPr>
+          <w:p>
+            <w:r>
+              <w:rPr>
+                <w:rFonts w:ascii="Tahoma" w:cs="Tahoma" w:eastAsia="Tahoma" w:hAnsi="Tahoma"/>
+                <w:sz w:val="18"/>
+                <w:szCs w:val="18"/>
+              </w:rPr>
+              <w:t xml:space="preserve">Njala Health Post</w:t>
+            </w:r>
+          </w:p>
+        </w:tc>
+        <w:tc>
+          <w:tcPr>
+            <w:tcW w:type="pct" w:w="25%"/>
+            <w:tcMar>
+              <w:top w:type="dxa" w:w="80"/>
+              <w:left w:type="dxa" w:w="100"/>
+              <w:bottom w:type="dxa" w:w="80"/>
+              <w:right w:type="dxa" w:w="100"/>
+            </w:tcMar>
+          </w:tcPr>
+          <w:p>
+            <w:r>
+              <w:rPr>
+                <w:rFonts w:ascii="Tahoma" w:cs="Tahoma" w:eastAsia="Tahoma" w:hAnsi="Tahoma"/>
+                <w:sz w:val="18"/>
+                <w:szCs w:val="18"/>
+              </w:rPr>
+              <w:t xml:space="preserve">Yes</w:t>
+            </w:r>
+          </w:p>
+        </w:tc>
+        <w:tc>
+          <w:tcPr>
+            <w:tcW w:type="pct" w:w="20%"/>
+            <w:tcMar>
+              <w:top w:type="dxa" w:w="80"/>
+              <w:left w:type="dxa" w:w="100"/>
+              <w:bottom w:type="dxa" w:w="80"/>
+              <w:right w:type="dxa" w:w="100"/>
+            </w:tcMar>
+          </w:tcPr>
+          <w:p>
+            <w:r>
+              <w:rPr>
+                <w:rFonts w:ascii="Tahoma" w:cs="Tahoma" w:eastAsia="Tahoma" w:hAnsi="Tahoma"/>
+                <w:sz w:val="18"/>
+                <w:szCs w:val="18"/>
+              </w:rPr>
+              <w:t xml:space="preserve">0</w:t>
+            </w:r>
+          </w:p>
+        </w:tc>
+      </w:tr>
+      <w:tr>
+        <w:tc>
+          <w:tcPr>
+            <w:tcW w:type="pct" w:w="20%"/>
+            <w:tcMar>
+              <w:top w:type="dxa" w:w="80"/>
+              <w:left w:type="dxa" w:w="100"/>
+              <w:bottom w:type="dxa" w:w="80"/>
+              <w:right w:type="dxa" w:w="100"/>
+            </w:tcMar>
+          </w:tcPr>
+          <w:p>
+            <w:r>
+              <w:rPr>
+                <w:rFonts w:ascii="Tahoma" w:cs="Tahoma" w:eastAsia="Tahoma" w:hAnsi="Tahoma"/>
+                <w:b/>
+                <w:bCs/>
+                <w:sz w:val="18"/>
+                <w:szCs w:val="18"/>
+              </w:rPr>
+              <w:t xml:space="preserve">2</w:t>
+            </w:r>
+          </w:p>
+        </w:tc>
+        <w:tc>
+          <w:tcPr>
+            <w:tcW w:type="pct" w:w="35%"/>
+            <w:tcMar>
+              <w:top w:type="dxa" w:w="80"/>
+              <w:left w:type="dxa" w:w="100"/>
+              <w:bottom w:type="dxa" w:w="80"/>
+              <w:right w:type="dxa" w:w="100"/>
+            </w:tcMar>
+          </w:tcPr>
+          <w:p>
+            <w:r>
+              <w:rPr>
+                <w:rFonts w:ascii="Tahoma" w:cs="Tahoma" w:eastAsia="Tahoma" w:hAnsi="Tahoma"/>
+                <w:sz w:val="18"/>
+                <w:szCs w:val="18"/>
+              </w:rPr>
+              <w:t xml:space="preserve">Gondama Health Post</w:t>
+            </w:r>
+          </w:p>
+        </w:tc>
+        <w:tc>
+          <w:tcPr>
+            <w:tcW w:type="pct" w:w="25%"/>
+            <w:tcMar>
+              <w:top w:type="dxa" w:w="80"/>
+              <w:left w:type="dxa" w:w="100"/>
+              <w:bottom w:type="dxa" w:w="80"/>
+              <w:right w:type="dxa" w:w="100"/>
+            </w:tcMar>
+          </w:tcPr>
+          <w:p>
+            <w:r>
+              <w:rPr>
+                <w:rFonts w:ascii="Tahoma" w:cs="Tahoma" w:eastAsia="Tahoma" w:hAnsi="Tahoma"/>
+                <w:sz w:val="18"/>
+                <w:szCs w:val="18"/>
+              </w:rPr>
+              <w:t xml:space="preserve">Yes</w:t>
+            </w:r>
+          </w:p>
+        </w:tc>
+        <w:tc>
+          <w:tcPr>
+            <w:tcW w:type="pct" w:w="20%"/>
+            <w:tcMar>
+              <w:top w:type="dxa" w:w="80"/>
+              <w:left w:type="dxa" w:w="100"/>
+              <w:bottom w:type="dxa" w:w="80"/>
+              <w:right w:type="dxa" w:w="100"/>
+            </w:tcMar>
+          </w:tcPr>
+          <w:p>
+            <w:r>
+              <w:rPr>
+                <w:rFonts w:ascii="Tahoma" w:cs="Tahoma" w:eastAsia="Tahoma" w:hAnsi="Tahoma"/>
+                <w:sz w:val="18"/>
+                <w:szCs w:val="18"/>
+              </w:rPr>
+              <w:t xml:space="preserve">3</w:t>
+            </w:r>
+          </w:p>
+        </w:tc>
+      </w:tr>
+      <w:tr>
+        <w:tc>
+          <w:tcPr>
+            <w:tcW w:type="pct" w:w="20%"/>
+            <w:tcMar>
+              <w:top w:type="dxa" w:w="80"/>
+              <w:left w:type="dxa" w:w="100"/>
+              <w:bottom w:type="dxa" w:w="80"/>
+              <w:right w:type="dxa" w:w="100"/>
+            </w:tcMar>
+          </w:tcPr>
+          <w:p>
+            <w:r>
+              <w:rPr>
+                <w:rFonts w:ascii="Tahoma" w:cs="Tahoma" w:eastAsia="Tahoma" w:hAnsi="Tahoma"/>
+                <w:b/>
+                <w:bCs/>
+                <w:sz w:val="18"/>
+                <w:szCs w:val="18"/>
+              </w:rPr>
+              <w:t xml:space="preserve">3</w:t>
+            </w:r>
+          </w:p>
+        </w:tc>
+        <w:tc>
+          <w:tcPr>
+            <w:tcW w:type="pct" w:w="35%"/>
+            <w:tcMar>
+              <w:top w:type="dxa" w:w="80"/>
+              <w:left w:type="dxa" w:w="100"/>
+              <w:bottom w:type="dxa" w:w="80"/>
+              <w:right w:type="dxa" w:w="100"/>
+            </w:tcMar>
+          </w:tcPr>
+          <w:p>
+            <w:r>
+              <w:rPr>
+                <w:rFonts w:ascii="Tahoma" w:cs="Tahoma" w:eastAsia="Tahoma" w:hAnsi="Tahoma"/>
+                <w:sz w:val="18"/>
+                <w:szCs w:val="18"/>
+              </w:rPr>
+              <w:t xml:space="preserve">Kenema Government Hospital</w:t>
+            </w:r>
+          </w:p>
+        </w:tc>
+        <w:tc>
+          <w:tcPr>
+            <w:tcW w:type="pct" w:w="25%"/>
+            <w:tcMar>
+              <w:top w:type="dxa" w:w="80"/>
+              <w:left w:type="dxa" w:w="100"/>
+              <w:bottom w:type="dxa" w:w="80"/>
+              <w:right w:type="dxa" w:w="100"/>
+            </w:tcMar>
+          </w:tcPr>
+          <w:p>
+            <w:r>
+              <w:rPr>
+                <w:rFonts w:ascii="Tahoma" w:cs="Tahoma" w:eastAsia="Tahoma" w:hAnsi="Tahoma"/>
+                <w:sz w:val="18"/>
+                <w:szCs w:val="18"/>
+              </w:rPr>
+              <w:t xml:space="preserve">Yes</w:t>
+            </w:r>
+          </w:p>
+        </w:tc>
+        <w:tc>
+          <w:tcPr>
+            <w:tcW w:type="pct" w:w="20%"/>
+            <w:tcMar>
+              <w:top w:type="dxa" w:w="80"/>
+              <w:left w:type="dxa" w:w="100"/>
+              <w:bottom w:type="dxa" w:w="80"/>
+              <w:right w:type="dxa" w:w="100"/>
+            </w:tcMar>
+          </w:tcPr>
+          <w:p>
+            <w:r>
+              <w:rPr>
+                <w:rFonts w:ascii="Tahoma" w:cs="Tahoma" w:eastAsia="Tahoma" w:hAnsi="Tahoma"/>
+                <w:sz w:val="18"/>
+                <w:szCs w:val="18"/>
+              </w:rPr>
+              <w:t xml:space="preserve">5</w:t>
+            </w:r>
+          </w:p>
+        </w:tc>
+      </w:tr>
+      <w:tr>
+        <w:tc>
+          <w:tcPr>
+            <w:tcW w:type="pct" w:w="20%"/>
+            <w:tcMar>
+              <w:top w:type="dxa" w:w="80"/>
+              <w:left w:type="dxa" w:w="100"/>
+              <w:bottom w:type="dxa" w:w="80"/>
+              <w:right w:type="dxa" w:w="100"/>
+            </w:tcMar>
+          </w:tcPr>
+          <w:p>
+            <w:r>
+              <w:rPr>
+                <w:rFonts w:ascii="Tahoma" w:cs="Tahoma" w:eastAsia="Tahoma" w:hAnsi="Tahoma"/>
+                <w:b/>
+                <w:bCs/>
+                <w:sz w:val="18"/>
+                <w:szCs w:val="18"/>
+              </w:rPr>
+              <w:t xml:space="preserve">4</w:t>
+            </w:r>
+          </w:p>
+        </w:tc>
+        <w:tc>
+          <w:tcPr>
+            <w:tcW w:type="pct" w:w="35%"/>
+            <w:tcMar>
+              <w:top w:type="dxa" w:w="80"/>
+              <w:left w:type="dxa" w:w="100"/>
+              <w:bottom w:type="dxa" w:w="80"/>
+              <w:right w:type="dxa" w:w="100"/>
+            </w:tcMar>
+          </w:tcPr>
+          <w:p>
+            <w:r>
+              <w:rPr>
+                <w:rFonts w:ascii="Tahoma" w:cs="Tahoma" w:eastAsia="Tahoma" w:hAnsi="Tahoma"/>
+                <w:sz w:val="18"/>
+                <w:szCs w:val="18"/>
+              </w:rPr>
+              <w:t xml:space="preserve">Bo Government Hospital</w:t>
+            </w:r>
+          </w:p>
+        </w:tc>
+        <w:tc>
+          <w:tcPr>
+            <w:tcW w:type="pct" w:w="25%"/>
+            <w:tcMar>
+              <w:top w:type="dxa" w:w="80"/>
+              <w:left w:type="dxa" w:w="100"/>
+              <w:bottom w:type="dxa" w:w="80"/>
+              <w:right w:type="dxa" w:w="100"/>
+            </w:tcMar>
+          </w:tcPr>
+          <w:p>
+            <w:r>
+              <w:rPr>
+                <w:rFonts w:ascii="Tahoma" w:cs="Tahoma" w:eastAsia="Tahoma" w:hAnsi="Tahoma"/>
+                <w:sz w:val="18"/>
+                <w:szCs w:val="18"/>
+              </w:rPr>
+              <w:t xml:space="preserve">No</w:t>
+            </w:r>
+          </w:p>
+        </w:tc>
+        <w:tc>
+          <w:tcPr>
+            <w:tcW w:type="pct" w:w="20%"/>
+            <w:tcMar>
+              <w:top w:type="dxa" w:w="80"/>
+              <w:left w:type="dxa" w:w="100"/>
+              <w:bottom w:type="dxa" w:w="80"/>
+              <w:right w:type="dxa" w:w="100"/>
+            </w:tcMar>
+          </w:tcPr>
+          <w:p>
+            <w:r>
+              <w:rPr>
+                <w:rFonts w:ascii="Tahoma" w:cs="Tahoma" w:eastAsia="Tahoma" w:hAnsi="Tahoma"/>
+                <w:sz w:val="18"/>
+                <w:szCs w:val="18"/>
+              </w:rPr>
+              <w:t xml:space="preserve">2</w:t>
+            </w:r>
+          </w:p>
+        </w:tc>
+      </w:tr>
+      <w:tr>
+        <w:tc>
+          <w:tcPr>
+            <w:tcW w:type="pct" w:w="20%"/>
+            <w:tcMar>
+              <w:top w:type="dxa" w:w="80"/>
+              <w:left w:type="dxa" w:w="100"/>
+              <w:bottom w:type="dxa" w:w="80"/>
+              <w:right w:type="dxa" w:w="100"/>
+            </w:tcMar>
+          </w:tcPr>
+          <w:p>
+            <w:r>
+              <w:rPr>
+                <w:rFonts w:ascii="Tahoma" w:cs="Tahoma" w:eastAsia="Tahoma" w:hAnsi="Tahoma"/>
+                <w:b/>
+                <w:bCs/>
+                <w:sz w:val="18"/>
+                <w:szCs w:val="18"/>
+              </w:rPr>
+              <w:t xml:space="preserve">5</w:t>
+            </w:r>
+          </w:p>
+        </w:tc>
+        <w:tc>
+          <w:tcPr>
+            <w:tcW w:type="pct" w:w="35%"/>
+            <w:tcMar>
+              <w:top w:type="dxa" w:w="80"/>
+              <w:left w:type="dxa" w:w="100"/>
+              <w:bottom w:type="dxa" w:w="80"/>
+              <w:right w:type="dxa" w:w="100"/>
+            </w:tcMar>
+          </w:tcPr>
+          <w:p>
+            <w:r>
+              <w:rPr>
+                <w:rFonts w:ascii="Tahoma" w:cs="Tahoma" w:eastAsia="Tahoma" w:hAnsi="Tahoma"/>
+                <w:sz w:val="18"/>
+                <w:szCs w:val="18"/>
+              </w:rPr>
+              <w:t xml:space="preserve">Serabu Health Centre</w:t>
+            </w:r>
+          </w:p>
+        </w:tc>
+        <w:tc>
+          <w:tcPr>
+            <w:tcW w:type="pct" w:w="25%"/>
+            <w:tcMar>
+              <w:top w:type="dxa" w:w="80"/>
+              <w:left w:type="dxa" w:w="100"/>
+              <w:bottom w:type="dxa" w:w="80"/>
+              <w:right w:type="dxa" w:w="100"/>
+            </w:tcMar>
+          </w:tcPr>
+          <w:p>
+            <w:r>
+              <w:rPr>
+                <w:rFonts w:ascii="Tahoma" w:cs="Tahoma" w:eastAsia="Tahoma" w:hAnsi="Tahoma"/>
+                <w:sz w:val="18"/>
+                <w:szCs w:val="18"/>
+              </w:rPr>
+              <w:t xml:space="preserve">No</w:t>
+            </w:r>
+          </w:p>
+        </w:tc>
+        <w:tc>
+          <w:tcPr>
+            <w:tcW w:type="pct" w:w="20%"/>
+            <w:tcMar>
+              <w:top w:type="dxa" w:w="80"/>
+              <w:left w:type="dxa" w:w="100"/>
+              <w:bottom w:type="dxa" w:w="80"/>
+              <w:right w:type="dxa" w:w="100"/>
+            </w:tcMar>
+          </w:tcPr>
+          <w:p>
+            <w:r>
+              <w:rPr>
+                <w:rFonts w:ascii="Tahoma" w:cs="Tahoma" w:eastAsia="Tahoma" w:hAnsi="Tahoma"/>
+                <w:sz w:val="18"/>
+                <w:szCs w:val="18"/>
+              </w:rPr>
+              <w:t xml:space="preserve">0</w:t>
+            </w:r>
+          </w:p>
+        </w:tc>
+      </w:tr>
+    </w:tbl>
+    <w:p>
+      <w:pPr>
+        <w:spacing w:after="160" w:line="276" w:lineRule="auto"/>
+        <w:jc w:val="both"/>
+      </w:pPr>
+      <w:r>
+        <w:rPr>
+          <w:rFonts w:ascii="Tahoma" w:cs="Tahoma" w:eastAsia="Tahoma" w:hAnsi="Tahoma"/>
+          <w:sz w:val="20"/>
+          <w:szCs w:val="20"/>
+        </w:rPr>
+        <w:t xml:space="preserve"> </w:t>
+      </w:r>
+    </w:p>
+    <w:p>
+      <w:pPr>
         <w:pStyle w:val="Heading2"/>
         <w:spacing w:after="120" w:before="240"/>
       </w:pPr>
@@ -5711,7 +6373,7 @@
           <w:sz w:val="24"/>
           <w:szCs w:val="24"/>
         </w:rPr>
-        <w:t xml:space="preserve">Scenario A: Routine availability check</w:t>
+        <w:t xml:space="preserve">Scenario A: Routine availability check (Menu option 1)</w:t>
       </w:r>
     </w:p>
     <w:p>
@@ -5725,7 +6387,7 @@
           <w:sz w:val="20"/>
           <w:szCs w:val="20"/>
         </w:rPr>
-        <w:t xml:space="preserve">Input: A CHW in Bo District dials the USSD code and selects "Check Availability", entering the patient's village as the location.</w:t>
+        <w:t xml:space="preserve">Input: Select "1. Check Clinic Availability".</w:t>
       </w:r>
     </w:p>
     <w:p>
@@ -5739,7 +6401,7 @@
           <w:sz w:val="20"/>
           <w:szCs w:val="20"/>
         </w:rPr>
-        <w:t xml:space="preserve">Processing: The system searches a 5 km radius; no clinic has an open slot, so the radius expands to 10 km, where one clinic with a doctor on duty and 3 open slots is found.</w:t>
+        <w:t xml:space="preserve">Processing: The system scans clinics nearest-first for the first one with both a doctor on duty and an open slot. Njala (#1) has a doctor but 0 open slots, so it is skipped; Gondama (#2) has a doctor and 3 open slots.</w:t>
       </w:r>
     </w:p>
     <w:p>
@@ -5755,7 +6417,7 @@
           <w:sz w:val="20"/>
           <w:szCs w:val="20"/>
         </w:rPr>
-        <w:t xml:space="preserve">Output: "Gondama Community Health Post - 3 slots available."</w:t>
+        <w:t xml:space="preserve">Output: "Gondama Health Post - 3 slot(s) available"</w:t>
       </w:r>
     </w:p>
     <w:p>
@@ -5772,7 +6434,7 @@
           <w:sz w:val="24"/>
           <w:szCs w:val="24"/>
         </w:rPr>
-        <w:t xml:space="preserve">Scenario B: Medicine not in stock nearby</w:t>
+        <w:t xml:space="preserve">Scenario B: Medicine stock check (Menu option 2)</w:t>
       </w:r>
     </w:p>
     <w:p>
@@ -5786,7 +6448,7 @@
           <w:sz w:val="20"/>
           <w:szCs w:val="20"/>
         </w:rPr>
-        <w:t xml:space="preserve">Input: A patient selects "Check Medicine" and enters "Artemisinin-based combination therapy" as the medicine and their chiefdom as the location.</w:t>
+        <w:t xml:space="preserve">Input: Select "2. Check ACT (Malaria Medicine) Stock".</w:t>
       </w:r>
     </w:p>
     <w:p>
@@ -5800,7 +6462,7 @@
           <w:sz w:val="20"/>
           <w:szCs w:val="20"/>
         </w:rPr>
-        <w:t xml:space="preserve">Processing: The system checks every clinic within 25 km; none report stock greater than zero for that medicine.</w:t>
+        <w:t xml:space="preserve">Processing: The system checks every clinic's ACT stock level, not just the nearest.</w:t>
       </w:r>
     </w:p>
     <w:p>
@@ -5816,7 +6478,7 @@
           <w:sz w:val="20"/>
           <w:szCs w:val="20"/>
         </w:rPr>
-        <w:t xml:space="preserve">Output: "Artemisinin-based combination therapy not currently in stock nearby."</w:t>
+        <w:t xml:space="preserve">Output: "Kenema Government Hospital has 12 unit(s) of ACT in stock" and "Serabu Health Centre has 6 unit(s) of ACT in stock"</w:t>
       </w:r>
     </w:p>
     <w:p>
@@ -5833,7 +6495,7 @@
           <w:sz w:val="24"/>
           <w:szCs w:val="24"/>
         </w:rPr>
-        <w:t xml:space="preserve">Scenario C: Successful appointment booking</w:t>
+        <w:t xml:space="preserve">Scenario C: Successful appointment booking (Menu option 3)</w:t>
       </w:r>
     </w:p>
     <w:p>
@@ -5847,7 +6509,7 @@
           <w:sz w:val="20"/>
           <w:szCs w:val="20"/>
         </w:rPr>
-        <w:t xml:space="preserve">Input: A returning, already-registered patient selects "Book Appointment", chooses a clinic, and requests a date three days from now.</w:t>
+        <w:t xml:space="preserve">Input: Select "3. Book Appointment", then enter clinic number 2 (Gondama Health Post).</w:t>
       </w:r>
     </w:p>
     <w:p>
@@ -5861,7 +6523,7 @@
           <w:sz w:val="20"/>
           <w:szCs w:val="20"/>
         </w:rPr>
-        <w:t xml:space="preserve">Processing: The chosen clinic has 2 open slots on that date, so the booking is confirmed and the clinic's open-slot count is reduced to 1.</w:t>
+        <w:t xml:space="preserve">Processing: Gondama has 3 open slots, so the booking is confirmed.</w:t>
       </w:r>
     </w:p>
     <w:p>
@@ -5877,7 +6539,7 @@
           <w:sz w:val="20"/>
           <w:szCs w:val="20"/>
         </w:rPr>
-        <w:t xml:space="preserve">Output: SMS -- "Appointment confirmed at Kenema Govt Hospital on 2026-10-14."</w:t>
+        <w:t xml:space="preserve">Output: "Appointment confirmed at Gondama Health Post"</w:t>
       </w:r>
     </w:p>
     <w:p>
@@ -5894,7 +6556,7 @@
           <w:sz w:val="24"/>
           <w:szCs w:val="24"/>
         </w:rPr>
-        <w:t xml:space="preserve">Scenario D: Emergency referral</w:t>
+        <w:t xml:space="preserve">Scenario D: Emergency referral (Menu option 4)</w:t>
       </w:r>
     </w:p>
     <w:p>
@@ -5908,7 +6570,7 @@
           <w:sz w:val="20"/>
           <w:szCs w:val="20"/>
         </w:rPr>
-        <w:t xml:space="preserve">Input: A CHW selects "Emergency Referral" and enters the symptom description "difficulty breathing" with the patient's location.</w:t>
+        <w:t xml:space="preserve">Input: Select "4. Emergency Referral", then enter true when asked whether this is an emergency.</w:t>
       </w:r>
     </w:p>
     <w:p>
@@ -5922,7 +6584,7 @@
           <w:sz w:val="20"/>
           <w:szCs w:val="20"/>
         </w:rPr>
-        <w:t xml:space="preserve">Processing: "difficulty breathing" matches an emergency keyword; the system searches outward and finds a staffed clinic 8 km away on the second expansion of the radius.</w:t>
+        <w:t xml:space="preserve">Processing: Unlike Scenario A, this search only requires a doctor on duty -- it does not require an open slot, because an emergency cannot wait for a routine booking slot to free up. Njala (#1) is the nearest clinic with a doctor, so it is selected immediately even though Scenario A had to skip it for being full.</w:t>
       </w:r>
     </w:p>
     <w:p>
@@ -5938,7 +6600,23 @@
           <w:sz w:val="20"/>
           <w:szCs w:val="20"/>
         </w:rPr>
-        <w:t xml:space="preserve">Output: "URGENT REFERRAL: Proceed to Serabu Community Health Centre immediately" and a notification SMS is sent to that clinic warning staff of the incoming patient.</w:t>
+        <w:t xml:space="preserve">Output: "URGENT REFERRAL: Proceed to Njala Health Post immediately"</w:t>
+      </w:r>
+    </w:p>
+    <w:p>
+      <w:pPr>
+        <w:spacing w:after="160" w:line="276" w:lineRule="auto"/>
+        <w:jc w:val="both"/>
+      </w:pPr>
+      <w:r>
+        <w:rPr>
+          <w:rFonts w:ascii="Tahoma" w:cs="Tahoma" w:eastAsia="Tahoma" w:hAnsi="Tahoma"/>
+          <w:i/>
+          <w:iCs/>
+          <w:sz w:val="20"/>
+          <w:szCs w:val="20"/>
+        </w:rPr>
+        <w:t xml:space="preserve">This contrast between Scenario A and Scenario D is deliberate: it demonstrates why the emergency branch is a separate module with its own, less restrictive condition, rather than reusing the availability-check logic.</w:t>
       </w:r>
     </w:p>
     <w:p>
@@ -5974,7 +6652,7 @@
           <w:sz w:val="20"/>
           <w:szCs w:val="20"/>
         </w:rPr>
-        <w:t xml:space="preserve">This project's report, pseudocode, and flowchart source are version-controlled in a GitHub repository named using the required convention PROG101_Assignment1_StudentName_StudentID. The repository contains a README.md describing the project, the pseudocode file, the flowchart source file, and this report, with regular commits made during development.</w:t>
+        <w:t xml:space="preserve">This project's report, pseudocode, and flowchart source (both the Mermaid diagram and the runnable Flowgorithm program, CHARS.fprg) are version-controlled in a GitHub repository named using the required convention PROG101_Assignment1_StudentName_StudentID. The repository contains a README.md describing the project, the pseudocode file, the flowchart source files, and this report, with regular commits made during development.</w:t>
       </w:r>
     </w:p>
     <w:p>

</xml_diff>

<commit_message>
Split flowchart into one legible diagram per module (fixes small print text)
Replaces the single combined diagram, which crammed ~30 nodes onto one
page and printed too small to read, with a simple overview diagram plus
one full-page diagram per module. Report and README updated to match.
</commit_message>
<xml_diff>
--- a/docs/CHARS_Assignment_Report.docx
+++ b/docs/CHARS_Assignment_Report.docx
@@ -885,7 +885,7 @@
           <w:sz w:val="20"/>
           <w:szCs w:val="20"/>
         </w:rPr>
-        <w:t xml:space="preserve">5. Functional Modules</w:t>
+        <w:t xml:space="preserve">    Figure 1 — System Overview</w:t>
       </w:r>
       <w:r>
         <w:rPr>
@@ -909,7 +909,7 @@
           <w:sz w:val="20"/>
           <w:szCs w:val="20"/>
         </w:rPr>
-        <w:t xml:space="preserve">6. Expected Outputs — Sample Scenarios</w:t>
+        <w:t xml:space="preserve">    Figure 2 — Check Clinic Availability</w:t>
       </w:r>
       <w:r>
         <w:rPr>
@@ -933,15 +933,15 @@
           <w:sz w:val="20"/>
           <w:szCs w:val="20"/>
         </w:rPr>
-        <w:t xml:space="preserve">7. GitHub Repository Evidence</w:t>
-      </w:r>
-      <w:r>
-        <w:rPr>
-          <w:rFonts w:ascii="Tahoma" w:cs="Tahoma" w:eastAsia="Tahoma" w:hAnsi="Tahoma"/>
-          <w:sz w:val="20"/>
-          <w:szCs w:val="20"/>
-        </w:rPr>
-        <w:t xml:space="preserve">	15</w:t>
+        <w:t xml:space="preserve">    Figure 3 — Check Medicine Stock</w:t>
+      </w:r>
+      <w:r>
+        <w:rPr>
+          <w:rFonts w:ascii="Tahoma" w:cs="Tahoma" w:eastAsia="Tahoma" w:hAnsi="Tahoma"/>
+          <w:sz w:val="20"/>
+          <w:szCs w:val="20"/>
+        </w:rPr>
+        <w:t xml:space="preserve">	14</w:t>
       </w:r>
     </w:p>
     <w:p>
@@ -957,6 +957,126 @@
           <w:sz w:val="20"/>
           <w:szCs w:val="20"/>
         </w:rPr>
+        <w:t xml:space="preserve">    Figure 4 — Book Appointment</w:t>
+      </w:r>
+      <w:r>
+        <w:rPr>
+          <w:rFonts w:ascii="Tahoma" w:cs="Tahoma" w:eastAsia="Tahoma" w:hAnsi="Tahoma"/>
+          <w:sz w:val="20"/>
+          <w:szCs w:val="20"/>
+        </w:rPr>
+        <w:t xml:space="preserve">	15</w:t>
+      </w:r>
+    </w:p>
+    <w:p>
+      <w:pPr>
+        <w:tabs>
+          <w:tab w:val="right" w:pos="9072" w:leader="dot"/>
+        </w:tabs>
+        <w:spacing w:after="140"/>
+      </w:pPr>
+      <w:r>
+        <w:rPr>
+          <w:rFonts w:ascii="Tahoma" w:cs="Tahoma" w:eastAsia="Tahoma" w:hAnsi="Tahoma"/>
+          <w:sz w:val="20"/>
+          <w:szCs w:val="20"/>
+        </w:rPr>
+        <w:t xml:space="preserve">    Figure 5 — Emergency Referral</w:t>
+      </w:r>
+      <w:r>
+        <w:rPr>
+          <w:rFonts w:ascii="Tahoma" w:cs="Tahoma" w:eastAsia="Tahoma" w:hAnsi="Tahoma"/>
+          <w:sz w:val="20"/>
+          <w:szCs w:val="20"/>
+        </w:rPr>
+        <w:t xml:space="preserve">	16</w:t>
+      </w:r>
+    </w:p>
+    <w:p>
+      <w:pPr>
+        <w:tabs>
+          <w:tab w:val="right" w:pos="9072" w:leader="dot"/>
+        </w:tabs>
+        <w:spacing w:after="140"/>
+      </w:pPr>
+      <w:r>
+        <w:rPr>
+          <w:rFonts w:ascii="Tahoma" w:cs="Tahoma" w:eastAsia="Tahoma" w:hAnsi="Tahoma"/>
+          <w:sz w:val="20"/>
+          <w:szCs w:val="20"/>
+        </w:rPr>
+        <w:t xml:space="preserve">5. Functional Modules</w:t>
+      </w:r>
+      <w:r>
+        <w:rPr>
+          <w:rFonts w:ascii="Tahoma" w:cs="Tahoma" w:eastAsia="Tahoma" w:hAnsi="Tahoma"/>
+          <w:sz w:val="20"/>
+          <w:szCs w:val="20"/>
+        </w:rPr>
+        <w:t xml:space="preserve">	17</w:t>
+      </w:r>
+    </w:p>
+    <w:p>
+      <w:pPr>
+        <w:tabs>
+          <w:tab w:val="right" w:pos="9072" w:leader="dot"/>
+        </w:tabs>
+        <w:spacing w:after="140"/>
+      </w:pPr>
+      <w:r>
+        <w:rPr>
+          <w:rFonts w:ascii="Tahoma" w:cs="Tahoma" w:eastAsia="Tahoma" w:hAnsi="Tahoma"/>
+          <w:sz w:val="20"/>
+          <w:szCs w:val="20"/>
+        </w:rPr>
+        <w:t xml:space="preserve">6. Expected Outputs — Sample Scenarios</w:t>
+      </w:r>
+      <w:r>
+        <w:rPr>
+          <w:rFonts w:ascii="Tahoma" w:cs="Tahoma" w:eastAsia="Tahoma" w:hAnsi="Tahoma"/>
+          <w:sz w:val="20"/>
+          <w:szCs w:val="20"/>
+        </w:rPr>
+        <w:t xml:space="preserve">	18</w:t>
+      </w:r>
+    </w:p>
+    <w:p>
+      <w:pPr>
+        <w:tabs>
+          <w:tab w:val="right" w:pos="9072" w:leader="dot"/>
+        </w:tabs>
+        <w:spacing w:after="140"/>
+      </w:pPr>
+      <w:r>
+        <w:rPr>
+          <w:rFonts w:ascii="Tahoma" w:cs="Tahoma" w:eastAsia="Tahoma" w:hAnsi="Tahoma"/>
+          <w:sz w:val="20"/>
+          <w:szCs w:val="20"/>
+        </w:rPr>
+        <w:t xml:space="preserve">7. GitHub Repository Evidence</w:t>
+      </w:r>
+      <w:r>
+        <w:rPr>
+          <w:rFonts w:ascii="Tahoma" w:cs="Tahoma" w:eastAsia="Tahoma" w:hAnsi="Tahoma"/>
+          <w:sz w:val="20"/>
+          <w:szCs w:val="20"/>
+        </w:rPr>
+        <w:t xml:space="preserve">	20</w:t>
+      </w:r>
+    </w:p>
+    <w:p>
+      <w:pPr>
+        <w:tabs>
+          <w:tab w:val="right" w:pos="9072" w:leader="dot"/>
+        </w:tabs>
+        <w:spacing w:after="140"/>
+      </w:pPr>
+      <w:r>
+        <w:rPr>
+          <w:rFonts w:ascii="Tahoma" w:cs="Tahoma" w:eastAsia="Tahoma" w:hAnsi="Tahoma"/>
+          <w:sz w:val="20"/>
+          <w:szCs w:val="20"/>
+        </w:rPr>
         <w:t xml:space="preserve">8. References</w:t>
       </w:r>
       <w:r>
@@ -965,7 +1085,7 @@
           <w:sz w:val="20"/>
           <w:szCs w:val="20"/>
         </w:rPr>
-        <w:t xml:space="preserve">	16</w:t>
+        <w:t xml:space="preserve">	21</w:t>
       </w:r>
     </w:p>
     <w:p>
@@ -4662,7 +4782,7 @@
           <w:sz w:val="20"/>
           <w:szCs w:val="20"/>
         </w:rPr>
-        <w:t xml:space="preserve">The flowchart below is the visual equivalent of the pseudocode in Section 3, showing the same four decision branches (Check Availability, Check Medicine, Book Appointment, Emergency Referral) and the expanding-radius search pattern shared by the availability and emergency branches. The source file (diagrams/flowchart.mmd, Mermaid format) is included in the project's GitHub repository and can also be opened and edited visually in diagrams.net (Draw.io).</w:t>
+        <w:t xml:space="preserve">The flowcharts below are the visual equivalent of the pseudocode in Section 3. To keep every box and label legible when printed, the system is shown as one simple overview diagram (Figure 1) plus one full-page diagram per module (Figures 2-5), rather than a single diagram with all branches combined. All five source files (diagrams/fig1_overview.mmd ... fig5_emergency.mmd, Mermaid format) are included in the project's GitHub repository and can also be opened and edited visually in diagrams.net (Draw.io).</w:t>
       </w:r>
     </w:p>
     <w:p>
@@ -4678,7 +4798,7 @@
           <w:sz w:val="20"/>
           <w:szCs w:val="20"/>
         </w:rPr>
-        <w:t xml:space="preserve">In addition to this overview diagram, the same logic was rebuilt as an executable flowchart in Flowgorithm (diagrams/CHARS.fprg, also in the repository), with each module (checkAvailability, checkMedicineStock, bookAppointment, referEmergency) as its own linked flowchart using Flowgorithm's Declare, Input, Output, If, While, For, and Call symbols. Because Flowgorithm has no record/struct data type, each clinic's details are represented as parallel arrays (clinicName, clinicDoctorOnDuty, clinicOpenSlots, clinicACTStock) rather than the Clinic record shown in Section 3 -- the decision and repetition logic is otherwise identical. This version can be run directly to produce the sample outputs in Section 6.</w:t>
+        <w:t xml:space="preserve">The same logic was additionally rebuilt as an executable flowchart in Flowgorithm (diagrams/CHARS.fprg, also in the repository), with each module as its own linked flowchart using Flowgorithm's Declare, Input, Output, If, While, For, and Call symbols. Because Flowgorithm has no record/struct data type, each clinic's details are represented as parallel arrays (clinicName, clinicDoctorOnDuty, clinicOpenSlots, clinicACTStock) rather than the Clinic record shown in Section 3 -- the decision and repetition logic is otherwise identical. This version can be run directly to produce the sample outputs in Section 6.</w:t>
       </w:r>
     </w:p>
     <w:p>
@@ -4695,12 +4815,12 @@
           <w:sz w:val="20"/>
           <w:szCs w:val="20"/>
         </w:rPr>
-        <w:t xml:space="preserve">Insert a screenshot of the Flowgorithm flowchart (Main and each procedure) below before printing.</w:t>
-      </w:r>
-    </w:p>
-    <w:p>
-      <w:pPr>
-        <w:spacing w:after="300" w:before="200"/>
+        <w:t xml:space="preserve">Insert a screenshot of the Flowgorithm flowchart below before printing.</w:t>
+      </w:r>
+    </w:p>
+    <w:p>
+      <w:pPr>
+        <w:spacing w:after="200" w:before="100"/>
       </w:pPr>
       <w:r>
         <w:rPr>
@@ -4711,18 +4831,40 @@
           <w:sz w:val="20"/>
           <w:szCs w:val="20"/>
         </w:rPr>
-        <w:t xml:space="preserve">[ Insert Flowgorithm screenshot(s) here ]</w:t>
-      </w:r>
-    </w:p>
-    <w:p>
-      <w:pPr>
-        <w:spacing w:after="200" w:before="200"/>
+        <w:t xml:space="preserve">[ Insert Flowgorithm screenshot here ]</w:t>
+      </w:r>
+    </w:p>
+    <w:p>
+      <w:r>
+        <w:br w:type="page"/>
+      </w:r>
+    </w:p>
+    <w:p>
+      <w:pPr>
+        <w:pStyle w:val="Heading2"/>
+        <w:spacing w:after="120" w:before="240"/>
+      </w:pPr>
+      <w:r>
+        <w:rPr>
+          <w:rFonts w:ascii="Tahoma" w:cs="Tahoma" w:eastAsia="Tahoma" w:hAnsi="Tahoma"/>
+          <w:b/>
+          <w:bCs/>
+          <w:color w:val="2E5395"/>
+          <w:sz w:val="24"/>
+          <w:szCs w:val="24"/>
+        </w:rPr>
+        <w:t xml:space="preserve">Figure 1 — System Overview</w:t>
+      </w:r>
+    </w:p>
+    <w:p>
+      <w:pPr>
+        <w:spacing w:after="100" w:before="200"/>
         <w:jc w:val="center"/>
       </w:pPr>
       <w:r>
         <w:drawing>
           <wp:inline distT="0" distB="0" distL="0" distR="0">
-            <wp:extent cx="5905500" cy="4410075"/>
+            <wp:extent cx="5715000" cy="3971925"/>
             <wp:effectExtent t="0" r="0" b="0" l="0"/>
             <wp:docPr id="1" name="" descr="" title=""/>
             <wp:cNvGraphicFramePr>
@@ -4747,7 +4889,7 @@
                   <pic:spPr bwMode="auto">
                     <a:xfrm>
                       <a:off x="0" y="0"/>
-                      <a:ext cx="5905500" cy="4410075"/>
+                      <a:ext cx="5715000" cy="3971925"/>
                     </a:xfrm>
                     <a:prstGeom prst="rect">
                       <a:avLst/>
@@ -4763,7 +4905,7 @@
     <w:p>
       <w:pPr>
         <w:spacing w:after="160" w:line="276" w:lineRule="auto"/>
-        <w:jc w:val="both"/>
+        <w:jc w:val="center"/>
       </w:pPr>
       <w:r>
         <w:rPr>
@@ -4773,7 +4915,343 @@
           <w:sz w:val="18"/>
           <w:szCs w:val="18"/>
         </w:rPr>
-        <w:t xml:space="preserve">Figure 1: CHARS system flowchart.</w:t>
+        <w:t xml:space="preserve">Figure 1: Main menu and routing to each module.</w:t>
+      </w:r>
+    </w:p>
+    <w:p>
+      <w:r>
+        <w:br w:type="page"/>
+      </w:r>
+    </w:p>
+    <w:p>
+      <w:pPr>
+        <w:pStyle w:val="Heading2"/>
+        <w:spacing w:after="120" w:before="240"/>
+      </w:pPr>
+      <w:r>
+        <w:rPr>
+          <w:rFonts w:ascii="Tahoma" w:cs="Tahoma" w:eastAsia="Tahoma" w:hAnsi="Tahoma"/>
+          <w:b/>
+          <w:bCs/>
+          <w:color w:val="2E5395"/>
+          <w:sz w:val="24"/>
+          <w:szCs w:val="24"/>
+        </w:rPr>
+        <w:t xml:space="preserve">Figure 2 — Check Clinic Availability</w:t>
+      </w:r>
+    </w:p>
+    <w:p>
+      <w:pPr>
+        <w:spacing w:after="100" w:before="200"/>
+        <w:jc w:val="center"/>
+      </w:pPr>
+      <w:r>
+        <w:drawing>
+          <wp:inline distT="0" distB="0" distL="0" distR="0">
+            <wp:extent cx="5715000" cy="5172075"/>
+            <wp:effectExtent t="0" r="0" b="0" l="0"/>
+            <wp:docPr id="1" name="" descr="" title=""/>
+            <wp:cNvGraphicFramePr>
+              <a:graphicFrameLocks xmlns:a="http://schemas.openxmlformats.org/drawingml/2006/main" noChangeAspect="1"/>
+            </wp:cNvGraphicFramePr>
+            <a:graphic xmlns:a="http://schemas.openxmlformats.org/drawingml/2006/main">
+              <a:graphicData uri="http://schemas.openxmlformats.org/drawingml/2006/picture">
+                <pic:pic xmlns:pic="http://schemas.openxmlformats.org/drawingml/2006/picture">
+                  <pic:nvPicPr>
+                    <pic:cNvPr id="0" name="" descr=""/>
+                    <pic:cNvPicPr>
+                      <a:picLocks noChangeAspect="1" noChangeArrowheads="1"/>
+                    </pic:cNvPicPr>
+                  </pic:nvPicPr>
+                  <pic:blipFill>
+                    <a:blip r:embed="rId10" cstate="none"/>
+                    <a:srcRect/>
+                    <a:stretch>
+                      <a:fillRect/>
+                    </a:stretch>
+                  </pic:blipFill>
+                  <pic:spPr bwMode="auto">
+                    <a:xfrm>
+                      <a:off x="0" y="0"/>
+                      <a:ext cx="5715000" cy="5172075"/>
+                    </a:xfrm>
+                    <a:prstGeom prst="rect">
+                      <a:avLst/>
+                    </a:prstGeom>
+                  </pic:spPr>
+                </pic:pic>
+              </a:graphicData>
+            </a:graphic>
+          </wp:inline>
+        </w:drawing>
+      </w:r>
+    </w:p>
+    <w:p>
+      <w:pPr>
+        <w:spacing w:after="160" w:line="276" w:lineRule="auto"/>
+        <w:jc w:val="center"/>
+      </w:pPr>
+      <w:r>
+        <w:rPr>
+          <w:rFonts w:ascii="Tahoma" w:cs="Tahoma" w:eastAsia="Tahoma" w:hAnsi="Tahoma"/>
+          <w:i/>
+          <w:iCs/>
+          <w:sz w:val="18"/>
+          <w:szCs w:val="18"/>
+        </w:rPr>
+        <w:t xml:space="preserve">Figure 2: checkAvailability() — expanding-radius search for a clinic with a doctor on duty and an open slot.</w:t>
+      </w:r>
+    </w:p>
+    <w:p>
+      <w:r>
+        <w:br w:type="page"/>
+      </w:r>
+    </w:p>
+    <w:p>
+      <w:pPr>
+        <w:pStyle w:val="Heading2"/>
+        <w:spacing w:after="120" w:before="240"/>
+      </w:pPr>
+      <w:r>
+        <w:rPr>
+          <w:rFonts w:ascii="Tahoma" w:cs="Tahoma" w:eastAsia="Tahoma" w:hAnsi="Tahoma"/>
+          <w:b/>
+          <w:bCs/>
+          <w:color w:val="2E5395"/>
+          <w:sz w:val="24"/>
+          <w:szCs w:val="24"/>
+        </w:rPr>
+        <w:t xml:space="preserve">Figure 3 — Check Medicine Stock</w:t>
+      </w:r>
+    </w:p>
+    <w:p>
+      <w:pPr>
+        <w:spacing w:after="100" w:before="200"/>
+        <w:jc w:val="center"/>
+      </w:pPr>
+      <w:r>
+        <w:drawing>
+          <wp:inline distT="0" distB="0" distL="0" distR="0">
+            <wp:extent cx="5133975" cy="7239000"/>
+            <wp:effectExtent t="0" r="0" b="0" l="0"/>
+            <wp:docPr id="1" name="" descr="" title=""/>
+            <wp:cNvGraphicFramePr>
+              <a:graphicFrameLocks xmlns:a="http://schemas.openxmlformats.org/drawingml/2006/main" noChangeAspect="1"/>
+            </wp:cNvGraphicFramePr>
+            <a:graphic xmlns:a="http://schemas.openxmlformats.org/drawingml/2006/main">
+              <a:graphicData uri="http://schemas.openxmlformats.org/drawingml/2006/picture">
+                <pic:pic xmlns:pic="http://schemas.openxmlformats.org/drawingml/2006/picture">
+                  <pic:nvPicPr>
+                    <pic:cNvPr id="0" name="" descr=""/>
+                    <pic:cNvPicPr>
+                      <a:picLocks noChangeAspect="1" noChangeArrowheads="1"/>
+                    </pic:cNvPicPr>
+                  </pic:nvPicPr>
+                  <pic:blipFill>
+                    <a:blip r:embed="rId11" cstate="none"/>
+                    <a:srcRect/>
+                    <a:stretch>
+                      <a:fillRect/>
+                    </a:stretch>
+                  </pic:blipFill>
+                  <pic:spPr bwMode="auto">
+                    <a:xfrm>
+                      <a:off x="0" y="0"/>
+                      <a:ext cx="5133975" cy="7239000"/>
+                    </a:xfrm>
+                    <a:prstGeom prst="rect">
+                      <a:avLst/>
+                    </a:prstGeom>
+                  </pic:spPr>
+                </pic:pic>
+              </a:graphicData>
+            </a:graphic>
+          </wp:inline>
+        </w:drawing>
+      </w:r>
+    </w:p>
+    <w:p>
+      <w:pPr>
+        <w:spacing w:after="160" w:line="276" w:lineRule="auto"/>
+        <w:jc w:val="center"/>
+      </w:pPr>
+      <w:r>
+        <w:rPr>
+          <w:rFonts w:ascii="Tahoma" w:cs="Tahoma" w:eastAsia="Tahoma" w:hAnsi="Tahoma"/>
+          <w:i/>
+          <w:iCs/>
+          <w:sz w:val="18"/>
+          <w:szCs w:val="18"/>
+        </w:rPr>
+        <w:t xml:space="preserve">Figure 3: checkMedicineStock() — scans nearby clinics' stock records for the requested medicine.</w:t>
+      </w:r>
+    </w:p>
+    <w:p>
+      <w:r>
+        <w:br w:type="page"/>
+      </w:r>
+    </w:p>
+    <w:p>
+      <w:pPr>
+        <w:pStyle w:val="Heading2"/>
+        <w:spacing w:after="120" w:before="240"/>
+      </w:pPr>
+      <w:r>
+        <w:rPr>
+          <w:rFonts w:ascii="Tahoma" w:cs="Tahoma" w:eastAsia="Tahoma" w:hAnsi="Tahoma"/>
+          <w:b/>
+          <w:bCs/>
+          <w:color w:val="2E5395"/>
+          <w:sz w:val="24"/>
+          <w:szCs w:val="24"/>
+        </w:rPr>
+        <w:t xml:space="preserve">Figure 4 — Book Appointment</w:t>
+      </w:r>
+    </w:p>
+    <w:p>
+      <w:pPr>
+        <w:spacing w:after="100" w:before="200"/>
+        <w:jc w:val="center"/>
+      </w:pPr>
+      <w:r>
+        <w:drawing>
+          <wp:inline distT="0" distB="0" distL="0" distR="0">
+            <wp:extent cx="3524250" cy="7239000"/>
+            <wp:effectExtent t="0" r="0" b="0" l="0"/>
+            <wp:docPr id="1" name="" descr="" title=""/>
+            <wp:cNvGraphicFramePr>
+              <a:graphicFrameLocks xmlns:a="http://schemas.openxmlformats.org/drawingml/2006/main" noChangeAspect="1"/>
+            </wp:cNvGraphicFramePr>
+            <a:graphic xmlns:a="http://schemas.openxmlformats.org/drawingml/2006/main">
+              <a:graphicData uri="http://schemas.openxmlformats.org/drawingml/2006/picture">
+                <pic:pic xmlns:pic="http://schemas.openxmlformats.org/drawingml/2006/picture">
+                  <pic:nvPicPr>
+                    <pic:cNvPr id="0" name="" descr=""/>
+                    <pic:cNvPicPr>
+                      <a:picLocks noChangeAspect="1" noChangeArrowheads="1"/>
+                    </pic:cNvPicPr>
+                  </pic:nvPicPr>
+                  <pic:blipFill>
+                    <a:blip r:embed="rId12" cstate="none"/>
+                    <a:srcRect/>
+                    <a:stretch>
+                      <a:fillRect/>
+                    </a:stretch>
+                  </pic:blipFill>
+                  <pic:spPr bwMode="auto">
+                    <a:xfrm>
+                      <a:off x="0" y="0"/>
+                      <a:ext cx="3524250" cy="7239000"/>
+                    </a:xfrm>
+                    <a:prstGeom prst="rect">
+                      <a:avLst/>
+                    </a:prstGeom>
+                  </pic:spPr>
+                </pic:pic>
+              </a:graphicData>
+            </a:graphic>
+          </wp:inline>
+        </w:drawing>
+      </w:r>
+    </w:p>
+    <w:p>
+      <w:pPr>
+        <w:spacing w:after="160" w:line="276" w:lineRule="auto"/>
+        <w:jc w:val="center"/>
+      </w:pPr>
+      <w:r>
+        <w:rPr>
+          <w:rFonts w:ascii="Tahoma" w:cs="Tahoma" w:eastAsia="Tahoma" w:hAnsi="Tahoma"/>
+          <w:i/>
+          <w:iCs/>
+          <w:sz w:val="18"/>
+          <w:szCs w:val="18"/>
+        </w:rPr>
+        <w:t xml:space="preserve">Figure 4: bookAppointment() — registers the patient if needed, then confirms or suggests an alternative date.</w:t>
+      </w:r>
+    </w:p>
+    <w:p>
+      <w:r>
+        <w:br w:type="page"/>
+      </w:r>
+    </w:p>
+    <w:p>
+      <w:pPr>
+        <w:pStyle w:val="Heading2"/>
+        <w:spacing w:after="120" w:before="240"/>
+      </w:pPr>
+      <w:r>
+        <w:rPr>
+          <w:rFonts w:ascii="Tahoma" w:cs="Tahoma" w:eastAsia="Tahoma" w:hAnsi="Tahoma"/>
+          <w:b/>
+          <w:bCs/>
+          <w:color w:val="2E5395"/>
+          <w:sz w:val="24"/>
+          <w:szCs w:val="24"/>
+        </w:rPr>
+        <w:t xml:space="preserve">Figure 5 — Emergency Referral</w:t>
+      </w:r>
+    </w:p>
+    <w:p>
+      <w:pPr>
+        <w:spacing w:after="100" w:before="200"/>
+        <w:jc w:val="center"/>
+      </w:pPr>
+      <w:r>
+        <w:drawing>
+          <wp:inline distT="0" distB="0" distL="0" distR="0">
+            <wp:extent cx="5715000" cy="5324475"/>
+            <wp:effectExtent t="0" r="0" b="0" l="0"/>
+            <wp:docPr id="1" name="" descr="" title=""/>
+            <wp:cNvGraphicFramePr>
+              <a:graphicFrameLocks xmlns:a="http://schemas.openxmlformats.org/drawingml/2006/main" noChangeAspect="1"/>
+            </wp:cNvGraphicFramePr>
+            <a:graphic xmlns:a="http://schemas.openxmlformats.org/drawingml/2006/main">
+              <a:graphicData uri="http://schemas.openxmlformats.org/drawingml/2006/picture">
+                <pic:pic xmlns:pic="http://schemas.openxmlformats.org/drawingml/2006/picture">
+                  <pic:nvPicPr>
+                    <pic:cNvPr id="0" name="" descr=""/>
+                    <pic:cNvPicPr>
+                      <a:picLocks noChangeAspect="1" noChangeArrowheads="1"/>
+                    </pic:cNvPicPr>
+                  </pic:nvPicPr>
+                  <pic:blipFill>
+                    <a:blip r:embed="rId13" cstate="none"/>
+                    <a:srcRect/>
+                    <a:stretch>
+                      <a:fillRect/>
+                    </a:stretch>
+                  </pic:blipFill>
+                  <pic:spPr bwMode="auto">
+                    <a:xfrm>
+                      <a:off x="0" y="0"/>
+                      <a:ext cx="5715000" cy="5324475"/>
+                    </a:xfrm>
+                    <a:prstGeom prst="rect">
+                      <a:avLst/>
+                    </a:prstGeom>
+                  </pic:spPr>
+                </pic:pic>
+              </a:graphicData>
+            </a:graphic>
+          </wp:inline>
+        </w:drawing>
+      </w:r>
+    </w:p>
+    <w:p>
+      <w:pPr>
+        <w:spacing w:after="160" w:line="276" w:lineRule="auto"/>
+        <w:jc w:val="center"/>
+      </w:pPr>
+      <w:r>
+        <w:rPr>
+          <w:rFonts w:ascii="Tahoma" w:cs="Tahoma" w:eastAsia="Tahoma" w:hAnsi="Tahoma"/>
+          <w:i/>
+          <w:iCs/>
+          <w:sz w:val="18"/>
+          <w:szCs w:val="18"/>
+        </w:rPr>
+        <w:t xml:space="preserve">Figure 5: referEmergency() — bypasses the open-slot requirement and searches only for a doctor on duty.</w:t>
       </w:r>
     </w:p>
     <w:p>

</xml_diff>

<commit_message>
Fix stale section cross-references found during a full numbering audit
- 1.11 Long-Term Sustainability pointed to 'Section 7' for modular
  design; the correct section is 5 (Functional Modules).
- 1.7 Algorithm Design Summary said the algorithm and pseudocode
  appear in 'Sections 3 and 4'; corrected to 2 and 3.
- 1.6 Computational Thinking now points to Sections 2 and 3 together,
  not just 3, since both show the full algorithm/pseudocode structures.
- GitHub evidence section: 'the Mermaid diagram' -> 'the five Mermaid
  diagrams' to match the actual Figure 1-5 split.
</commit_message>
<xml_diff>
--- a/docs/CHARS_Assignment_Report.docx
+++ b/docs/CHARS_Assignment_Report.docx
@@ -1412,7 +1412,7 @@
           <w:sz w:val="20"/>
           <w:szCs w:val="20"/>
         </w:rPr>
-        <w:t xml:space="preserve">Algorithm design -- each sub-problem was translated into an explicit, step-by-step algorithm using sequence, selection (IF/ELSE), and repetition (WHILE/FOR EACH) structures, shown in full in Section 3.</w:t>
+        <w:t xml:space="preserve">Algorithm design -- each sub-problem was translated into an explicit, step-by-step algorithm using sequence, selection (IF/ELSE), and repetition (WHILE/FOR EACH) structures, shown in full in Sections 2 and 3.</w:t>
       </w:r>
     </w:p>
     <w:p>
@@ -1443,7 +1443,7 @@
           <w:sz w:val="20"/>
           <w:szCs w:val="20"/>
         </w:rPr>
-        <w:t xml:space="preserve">The full step-by-step algorithm and pseudocode appear in Sections 3 and 4. In summary, the system presents a main menu, routes the user's choice to one of four modules using a decision structure, and each module uses a repetition structure to search outward from the user's location for a clinic that meets the required condition, stopping either when a match is found or when a maximum search radius is reached.</w:t>
+        <w:t xml:space="preserve">The full step-by-step algorithm and pseudocode appear in Sections 2 and 3. In summary, the system presents a main menu, routes the user's choice to one of four modules using a decision structure, and each module uses a repetition structure to search outward from the user's location for a clinic that meets the required condition, stopping either when a match is found or when a maximum search radius is reached.</w:t>
       </w:r>
     </w:p>
     <w:p>
@@ -1624,7 +1624,7 @@
           <w:sz w:val="20"/>
           <w:szCs w:val="20"/>
         </w:rPr>
-        <w:t xml:space="preserve">Because CHARS runs over basic USSD/SMS (no smartphone, app installation, or data plan required for patients) and is built on open source components (no recurring licence fees), it does not depend on continued external funding to keep running. Ongoing maintenance could reasonably be handed to a local university ICT department or a Ministry of Health digital health unit, and the modular design (Section 7) means new SDG-aligned features can be added -- for example a maternal health check-in module -- without redesigning the whole system.</w:t>
+        <w:t xml:space="preserve">Because CHARS runs over basic USSD/SMS (no smartphone, app installation, or data plan required for patients) and is built on open source components (no recurring licence fees), it does not depend on continued external funding to keep running. Ongoing maintenance could reasonably be handed to a local university ICT department or a Ministry of Health digital health unit, and the modular design (Section 5) means new SDG-aligned features can be added -- for example a maternal health check-in module -- without redesigning the whole system.</w:t>
       </w:r>
     </w:p>
     <w:p>
@@ -7130,7 +7130,7 @@
           <w:sz w:val="20"/>
           <w:szCs w:val="20"/>
         </w:rPr>
-        <w:t xml:space="preserve">This project's report, pseudocode, and flowchart source (both the Mermaid diagram and the runnable Flowgorithm program, CHARS.fprg) are version-controlled in a GitHub repository named using the required convention PROG101_Assignment1_StudentName_StudentID. The repository contains a README.md describing the project, the pseudocode file, the flowchart source files, and this report, with regular commits made during development.</w:t>
+        <w:t xml:space="preserve">This project's report, pseudocode, and flowchart source (both the five Mermaid diagrams in Section 4 and the runnable Flowgorithm program, CHARS.fprg) are version-controlled in a GitHub repository named using the required convention PROG101_Assignment1_StudentName_StudentID. The repository contains a README.md describing the project, the pseudocode file, the flowchart source files, and this report, with regular commits made during development.</w:t>
       </w:r>
     </w:p>
     <w:p>

</xml_diff>

<commit_message>
Rebuild flowchart in diagrams.net (Draw.io)
- Adds diagrams/CHARS.drawio: the full five-figure flowchart (Figure 1
  overview + one full-page diagram per module) authored directly as a
  diagrams.net (Draw.io) file -- one of the three flowcharting tools
  named in the assignment brief (Section 2.III) -- instead of Mermaid.
- Adds generate_drawio_flowchart.py: builds CHARS.drawio and renders
  each of its five pages to a high-resolution PNG from one shared
  layout definition, so the .drawio file and the report images always
  match and stay legible when printed.
- Replaces the five Mermaid-based figures in the report with the new
  Draw.io renders (same logic/content, same five-figure split kept for
  print legibility) and updates the flowchart section text, the GitHub
  Evidence section, and the references list accordingly.
- Removes the now-superseded Mermaid flowchart source/PNG files.
- Updates README.md to document CHARS.drawio in place of the Mermaid
  sources.
</commit_message>
<xml_diff>
--- a/docs/CHARS_Assignment_Report.docx
+++ b/docs/CHARS_Assignment_Report.docx
@@ -4782,7 +4782,7 @@
           <w:sz w:val="20"/>
           <w:szCs w:val="20"/>
         </w:rPr>
-        <w:t xml:space="preserve">The flowcharts below are the visual equivalent of the pseudocode in Section 3. To keep every box and label legible when printed, the system is shown as one simple overview diagram (Figure 1) plus one full-page diagram per module (Figures 2-5), rather than a single diagram with all branches combined. All five source files (diagrams/fig1_overview.mmd ... fig5_emergency.mmd, Mermaid format) are included in the project's GitHub repository and can also be opened and edited visually in diagrams.net (Draw.io).</w:t>
+        <w:t xml:space="preserve">The flowcharts below are the visual equivalent of the pseudocode in Section 3, built in diagrams.net (Draw.io) -- one of the flowcharting tools named in the assignment brief. To keep every box and label legible when printed, the system is shown as one simple overview diagram (Figure 1) plus one full-page diagram per module (Figures 2-5), rather than a single diagram with all branches combined. The source file (diagrams/CHARS.drawio, containing all five diagrams as separate pages) is included in the project's GitHub repository and can be opened and edited directly at https://app.diagrams.net (File &gt; Open From &gt; Device).</w:t>
       </w:r>
     </w:p>
     <w:p>
@@ -4864,7 +4864,7 @@
       <w:r>
         <w:drawing>
           <wp:inline distT="0" distB="0" distL="0" distR="0">
-            <wp:extent cx="5715000" cy="3971925"/>
+            <wp:extent cx="5715000" cy="3848100"/>
             <wp:effectExtent t="0" r="0" b="0" l="0"/>
             <wp:docPr id="1" name="" descr="" title=""/>
             <wp:cNvGraphicFramePr>
@@ -4889,7 +4889,7 @@
                   <pic:spPr bwMode="auto">
                     <a:xfrm>
                       <a:off x="0" y="0"/>
-                      <a:ext cx="5715000" cy="3971925"/>
+                      <a:ext cx="5715000" cy="3848100"/>
                     </a:xfrm>
                     <a:prstGeom prst="rect">
                       <a:avLst/>
@@ -4948,7 +4948,7 @@
       <w:r>
         <w:drawing>
           <wp:inline distT="0" distB="0" distL="0" distR="0">
-            <wp:extent cx="5715000" cy="5172075"/>
+            <wp:extent cx="5715000" cy="5191125"/>
             <wp:effectExtent t="0" r="0" b="0" l="0"/>
             <wp:docPr id="1" name="" descr="" title=""/>
             <wp:cNvGraphicFramePr>
@@ -4973,7 +4973,7 @@
                   <pic:spPr bwMode="auto">
                     <a:xfrm>
                       <a:off x="0" y="0"/>
-                      <a:ext cx="5715000" cy="5172075"/>
+                      <a:ext cx="5715000" cy="5191125"/>
                     </a:xfrm>
                     <a:prstGeom prst="rect">
                       <a:avLst/>
@@ -5032,7 +5032,7 @@
       <w:r>
         <w:drawing>
           <wp:inline distT="0" distB="0" distL="0" distR="0">
-            <wp:extent cx="5133975" cy="7239000"/>
+            <wp:extent cx="5715000" cy="6334125"/>
             <wp:effectExtent t="0" r="0" b="0" l="0"/>
             <wp:docPr id="1" name="" descr="" title=""/>
             <wp:cNvGraphicFramePr>
@@ -5057,7 +5057,7 @@
                   <pic:spPr bwMode="auto">
                     <a:xfrm>
                       <a:off x="0" y="0"/>
-                      <a:ext cx="5133975" cy="7239000"/>
+                      <a:ext cx="5715000" cy="6334125"/>
                     </a:xfrm>
                     <a:prstGeom prst="rect">
                       <a:avLst/>
@@ -5116,7 +5116,7 @@
       <w:r>
         <w:drawing>
           <wp:inline distT="0" distB="0" distL="0" distR="0">
-            <wp:extent cx="3524250" cy="7239000"/>
+            <wp:extent cx="5372100" cy="7239000"/>
             <wp:effectExtent t="0" r="0" b="0" l="0"/>
             <wp:docPr id="1" name="" descr="" title=""/>
             <wp:cNvGraphicFramePr>
@@ -5141,7 +5141,7 @@
                   <pic:spPr bwMode="auto">
                     <a:xfrm>
                       <a:off x="0" y="0"/>
-                      <a:ext cx="3524250" cy="7239000"/>
+                      <a:ext cx="5372100" cy="7239000"/>
                     </a:xfrm>
                     <a:prstGeom prst="rect">
                       <a:avLst/>
@@ -5200,7 +5200,7 @@
       <w:r>
         <w:drawing>
           <wp:inline distT="0" distB="0" distL="0" distR="0">
-            <wp:extent cx="5715000" cy="5324475"/>
+            <wp:extent cx="5715000" cy="6477000"/>
             <wp:effectExtent t="0" r="0" b="0" l="0"/>
             <wp:docPr id="1" name="" descr="" title=""/>
             <wp:cNvGraphicFramePr>
@@ -5225,7 +5225,7 @@
                   <pic:spPr bwMode="auto">
                     <a:xfrm>
                       <a:off x="0" y="0"/>
-                      <a:ext cx="5715000" cy="5324475"/>
+                      <a:ext cx="5715000" cy="6477000"/>
                     </a:xfrm>
                     <a:prstGeom prst="rect">
                       <a:avLst/>
@@ -7130,7 +7130,7 @@
           <w:sz w:val="20"/>
           <w:szCs w:val="20"/>
         </w:rPr>
-        <w:t xml:space="preserve">This project's report, pseudocode, and flowchart source (both the five Mermaid diagrams in Section 4 and the runnable Flowgorithm program, CHARS.fprg) are version-controlled in a GitHub repository named using the required convention PROG101_Assignment1_StudentName_StudentID. The repository contains a README.md describing the project, the pseudocode file, the flowchart source files, and this report, with regular commits made during development.</w:t>
+        <w:t xml:space="preserve">This project's report, pseudocode, and flowchart source (both the diagrams.net/Draw.io file behind the five figures in Section 4, CHARS.drawio, and the runnable Flowgorithm program, CHARS.fprg) are version-controlled in a GitHub repository named using the required convention PROG101_Assignment1_StudentName_StudentID. The repository contains a README.md describing the project, the pseudocode file, the flowchart source files, and this report, with regular commits made during development.</w:t>
       </w:r>
     </w:p>
     <w:p>
@@ -7331,7 +7331,7 @@
           <w:sz w:val="20"/>
           <w:szCs w:val="20"/>
         </w:rPr>
-        <w:t xml:space="preserve">Mermaid.js Documentation. (n.d.). Flowchart Syntax. https://mermaid.js.org</w:t>
+        <w:t xml:space="preserve">JGraph Ltd (diagrams.net / Draw.io). (n.d.). Documentation. https://www.drawio.com/doc/</w:t>
       </w:r>
     </w:p>
     <w:sectPr>

</xml_diff>